<commit_message>
co ve primary habitual
</commit_message>
<xml_diff>
--- a/analysis/Anxiety Episodic x SA/summary_anxiety_episodic_sa.docx
+++ b/analysis/Anxiety Episodic x SA/summary_anxiety_episodic_sa.docx
@@ -5,7 +5,13 @@
     <w:p>
       <w:pPr>
         <w:rPr>
-          <w:rFonts w:hint="eastAsia"/>
+          <w:lang w:eastAsia="zh-CN"/>
+        </w:rPr>
+      </w:pPr>
+    </w:p>
+    <w:p>
+      <w:pPr>
+        <w:rPr>
           <w:lang w:eastAsia="zh-CN"/>
         </w:rPr>
       </w:pPr>
@@ -125,16 +131,14 @@
     <w:rPrDefault>
       <w:rPr>
         <w:rFonts w:asciiTheme="minorHAnsi" w:eastAsiaTheme="minorEastAsia" w:hAnsiTheme="minorHAnsi" w:cstheme="minorBidi"/>
-        <w:kern w:val="2"/>
-        <w:sz w:val="24"/>
-        <w:szCs w:val="24"/>
+        <w:sz w:val="21"/>
+        <w:szCs w:val="21"/>
         <w:lang w:val="en-US" w:eastAsia="en-US" w:bidi="ar-SA"/>
-        <w14:ligatures w14:val="standardContextual"/>
       </w:rPr>
     </w:rPrDefault>
     <w:pPrDefault>
       <w:pPr>
-        <w:spacing w:after="160" w:line="278" w:lineRule="auto"/>
+        <w:spacing w:after="160" w:line="276" w:lineRule="auto"/>
       </w:pPr>
     </w:pPrDefault>
   </w:docDefaults>
@@ -519,6 +523,7 @@
   <w:style w:type="paragraph" w:default="1" w:styleId="a">
     <w:name w:val="Normal"/>
     <w:qFormat/>
+    <w:rsid w:val="00F00DA0"/>
   </w:style>
   <w:style w:type="paragraph" w:styleId="1">
     <w:name w:val="heading 1"/>
@@ -527,16 +532,19 @@
     <w:link w:val="1Char"/>
     <w:uiPriority w:val="9"/>
     <w:qFormat/>
-    <w:rsid w:val="00426FC2"/>
+    <w:rsid w:val="00F00DA0"/>
     <w:pPr>
       <w:keepNext/>
       <w:keepLines/>
-      <w:spacing w:before="360" w:after="80"/>
+      <w:pBdr>
+        <w:bottom w:val="single" w:sz="4" w:space="2" w:color="E97132" w:themeColor="accent2"/>
+      </w:pBdr>
+      <w:spacing w:before="360" w:after="120" w:line="240" w:lineRule="auto"/>
       <w:outlineLvl w:val="0"/>
     </w:pPr>
     <w:rPr>
       <w:rFonts w:asciiTheme="majorHAnsi" w:eastAsiaTheme="majorEastAsia" w:hAnsiTheme="majorHAnsi" w:cstheme="majorBidi"/>
-      <w:color w:val="0F4761" w:themeColor="accent1" w:themeShade="BF"/>
+      <w:color w:val="262626" w:themeColor="text1" w:themeTint="D9"/>
       <w:sz w:val="40"/>
       <w:szCs w:val="40"/>
     </w:rPr>
@@ -550,178 +558,193 @@
     <w:semiHidden/>
     <w:unhideWhenUsed/>
     <w:qFormat/>
-    <w:rsid w:val="00426FC2"/>
+    <w:rsid w:val="00F00DA0"/>
     <w:pPr>
       <w:keepNext/>
       <w:keepLines/>
-      <w:spacing w:before="160" w:after="80"/>
+      <w:spacing w:before="120" w:after="0" w:line="240" w:lineRule="auto"/>
       <w:outlineLvl w:val="1"/>
     </w:pPr>
     <w:rPr>
       <w:rFonts w:asciiTheme="majorHAnsi" w:eastAsiaTheme="majorEastAsia" w:hAnsiTheme="majorHAnsi" w:cstheme="majorBidi"/>
-      <w:color w:val="0F4761" w:themeColor="accent1" w:themeShade="BF"/>
+      <w:color w:val="E97132" w:themeColor="accent2"/>
+      <w:sz w:val="36"/>
+      <w:szCs w:val="36"/>
+    </w:rPr>
+  </w:style>
+  <w:style w:type="paragraph" w:styleId="3">
+    <w:name w:val="heading 3"/>
+    <w:basedOn w:val="a"/>
+    <w:next w:val="a"/>
+    <w:link w:val="3Char"/>
+    <w:uiPriority w:val="9"/>
+    <w:semiHidden/>
+    <w:unhideWhenUsed/>
+    <w:qFormat/>
+    <w:rsid w:val="00F00DA0"/>
+    <w:pPr>
+      <w:keepNext/>
+      <w:keepLines/>
+      <w:spacing w:before="80" w:after="0" w:line="240" w:lineRule="auto"/>
+      <w:outlineLvl w:val="2"/>
+    </w:pPr>
+    <w:rPr>
+      <w:rFonts w:asciiTheme="majorHAnsi" w:eastAsiaTheme="majorEastAsia" w:hAnsiTheme="majorHAnsi" w:cstheme="majorBidi"/>
+      <w:color w:val="BF4E14" w:themeColor="accent2" w:themeShade="BF"/>
       <w:sz w:val="32"/>
       <w:szCs w:val="32"/>
     </w:rPr>
   </w:style>
-  <w:style w:type="paragraph" w:styleId="3">
-    <w:name w:val="heading 3"/>
+  <w:style w:type="paragraph" w:styleId="4">
+    <w:name w:val="heading 4"/>
     <w:basedOn w:val="a"/>
     <w:next w:val="a"/>
-    <w:link w:val="3Char"/>
+    <w:link w:val="4Char"/>
     <w:uiPriority w:val="9"/>
     <w:semiHidden/>
     <w:unhideWhenUsed/>
     <w:qFormat/>
-    <w:rsid w:val="00426FC2"/>
+    <w:rsid w:val="00F00DA0"/>
     <w:pPr>
       <w:keepNext/>
       <w:keepLines/>
-      <w:spacing w:before="160" w:after="80"/>
-      <w:outlineLvl w:val="2"/>
-    </w:pPr>
-    <w:rPr>
-      <w:rFonts w:eastAsiaTheme="majorEastAsia" w:cstheme="majorBidi"/>
-      <w:color w:val="0F4761" w:themeColor="accent1" w:themeShade="BF"/>
+      <w:spacing w:before="80" w:after="0" w:line="240" w:lineRule="auto"/>
+      <w:outlineLvl w:val="3"/>
+    </w:pPr>
+    <w:rPr>
+      <w:rFonts w:asciiTheme="majorHAnsi" w:eastAsiaTheme="majorEastAsia" w:hAnsiTheme="majorHAnsi" w:cstheme="majorBidi"/>
+      <w:i/>
+      <w:iCs/>
+      <w:color w:val="80340D" w:themeColor="accent2" w:themeShade="80"/>
       <w:sz w:val="28"/>
       <w:szCs w:val="28"/>
     </w:rPr>
   </w:style>
-  <w:style w:type="paragraph" w:styleId="4">
-    <w:name w:val="heading 4"/>
+  <w:style w:type="paragraph" w:styleId="5">
+    <w:name w:val="heading 5"/>
     <w:basedOn w:val="a"/>
     <w:next w:val="a"/>
-    <w:link w:val="4Char"/>
+    <w:link w:val="5Char"/>
     <w:uiPriority w:val="9"/>
     <w:semiHidden/>
     <w:unhideWhenUsed/>
     <w:qFormat/>
-    <w:rsid w:val="00426FC2"/>
+    <w:rsid w:val="00F00DA0"/>
     <w:pPr>
       <w:keepNext/>
       <w:keepLines/>
-      <w:spacing w:before="80" w:after="40"/>
-      <w:outlineLvl w:val="3"/>
-    </w:pPr>
-    <w:rPr>
-      <w:rFonts w:eastAsiaTheme="majorEastAsia" w:cstheme="majorBidi"/>
+      <w:spacing w:before="80" w:after="0" w:line="240" w:lineRule="auto"/>
+      <w:outlineLvl w:val="4"/>
+    </w:pPr>
+    <w:rPr>
+      <w:rFonts w:asciiTheme="majorHAnsi" w:eastAsiaTheme="majorEastAsia" w:hAnsiTheme="majorHAnsi" w:cstheme="majorBidi"/>
+      <w:color w:val="BF4E14" w:themeColor="accent2" w:themeShade="BF"/>
+      <w:sz w:val="24"/>
+      <w:szCs w:val="24"/>
+    </w:rPr>
+  </w:style>
+  <w:style w:type="paragraph" w:styleId="6">
+    <w:name w:val="heading 6"/>
+    <w:basedOn w:val="a"/>
+    <w:next w:val="a"/>
+    <w:link w:val="6Char"/>
+    <w:uiPriority w:val="9"/>
+    <w:semiHidden/>
+    <w:unhideWhenUsed/>
+    <w:qFormat/>
+    <w:rsid w:val="00F00DA0"/>
+    <w:pPr>
+      <w:keepNext/>
+      <w:keepLines/>
+      <w:spacing w:before="80" w:after="0" w:line="240" w:lineRule="auto"/>
+      <w:outlineLvl w:val="5"/>
+    </w:pPr>
+    <w:rPr>
+      <w:rFonts w:asciiTheme="majorHAnsi" w:eastAsiaTheme="majorEastAsia" w:hAnsiTheme="majorHAnsi" w:cstheme="majorBidi"/>
       <w:i/>
       <w:iCs/>
-      <w:color w:val="0F4761" w:themeColor="accent1" w:themeShade="BF"/>
-    </w:rPr>
-  </w:style>
-  <w:style w:type="paragraph" w:styleId="5">
-    <w:name w:val="heading 5"/>
+      <w:color w:val="80340D" w:themeColor="accent2" w:themeShade="80"/>
+      <w:sz w:val="24"/>
+      <w:szCs w:val="24"/>
+    </w:rPr>
+  </w:style>
+  <w:style w:type="paragraph" w:styleId="7">
+    <w:name w:val="heading 7"/>
     <w:basedOn w:val="a"/>
     <w:next w:val="a"/>
-    <w:link w:val="5Char"/>
+    <w:link w:val="7Char"/>
     <w:uiPriority w:val="9"/>
     <w:semiHidden/>
     <w:unhideWhenUsed/>
     <w:qFormat/>
-    <w:rsid w:val="00426FC2"/>
+    <w:rsid w:val="00F00DA0"/>
     <w:pPr>
       <w:keepNext/>
       <w:keepLines/>
-      <w:spacing w:before="80" w:after="40"/>
-      <w:outlineLvl w:val="4"/>
-    </w:pPr>
-    <w:rPr>
-      <w:rFonts w:eastAsiaTheme="majorEastAsia" w:cstheme="majorBidi"/>
-      <w:color w:val="0F4761" w:themeColor="accent1" w:themeShade="BF"/>
-    </w:rPr>
-  </w:style>
-  <w:style w:type="paragraph" w:styleId="6">
-    <w:name w:val="heading 6"/>
+      <w:spacing w:before="80" w:after="0" w:line="240" w:lineRule="auto"/>
+      <w:outlineLvl w:val="6"/>
+    </w:pPr>
+    <w:rPr>
+      <w:rFonts w:asciiTheme="majorHAnsi" w:eastAsiaTheme="majorEastAsia" w:hAnsiTheme="majorHAnsi" w:cstheme="majorBidi"/>
+      <w:b/>
+      <w:bCs/>
+      <w:color w:val="80340D" w:themeColor="accent2" w:themeShade="80"/>
+      <w:sz w:val="22"/>
+      <w:szCs w:val="22"/>
+    </w:rPr>
+  </w:style>
+  <w:style w:type="paragraph" w:styleId="8">
+    <w:name w:val="heading 8"/>
     <w:basedOn w:val="a"/>
     <w:next w:val="a"/>
-    <w:link w:val="6Char"/>
+    <w:link w:val="8Char"/>
     <w:uiPriority w:val="9"/>
     <w:semiHidden/>
     <w:unhideWhenUsed/>
     <w:qFormat/>
-    <w:rsid w:val="00426FC2"/>
+    <w:rsid w:val="00F00DA0"/>
     <w:pPr>
       <w:keepNext/>
       <w:keepLines/>
-      <w:spacing w:before="40" w:after="0"/>
-      <w:outlineLvl w:val="5"/>
-    </w:pPr>
-    <w:rPr>
-      <w:rFonts w:eastAsiaTheme="majorEastAsia" w:cstheme="majorBidi"/>
+      <w:spacing w:before="80" w:after="0" w:line="240" w:lineRule="auto"/>
+      <w:outlineLvl w:val="7"/>
+    </w:pPr>
+    <w:rPr>
+      <w:rFonts w:asciiTheme="majorHAnsi" w:eastAsiaTheme="majorEastAsia" w:hAnsiTheme="majorHAnsi" w:cstheme="majorBidi"/>
+      <w:color w:val="80340D" w:themeColor="accent2" w:themeShade="80"/>
+      <w:sz w:val="22"/>
+      <w:szCs w:val="22"/>
+    </w:rPr>
+  </w:style>
+  <w:style w:type="paragraph" w:styleId="9">
+    <w:name w:val="heading 9"/>
+    <w:basedOn w:val="a"/>
+    <w:next w:val="a"/>
+    <w:link w:val="9Char"/>
+    <w:uiPriority w:val="9"/>
+    <w:semiHidden/>
+    <w:unhideWhenUsed/>
+    <w:qFormat/>
+    <w:rsid w:val="00F00DA0"/>
+    <w:pPr>
+      <w:keepNext/>
+      <w:keepLines/>
+      <w:spacing w:before="80" w:after="0" w:line="240" w:lineRule="auto"/>
+      <w:outlineLvl w:val="8"/>
+    </w:pPr>
+    <w:rPr>
+      <w:rFonts w:asciiTheme="majorHAnsi" w:eastAsiaTheme="majorEastAsia" w:hAnsiTheme="majorHAnsi" w:cstheme="majorBidi"/>
       <w:i/>
       <w:iCs/>
-      <w:color w:val="595959" w:themeColor="text1" w:themeTint="A6"/>
-    </w:rPr>
-  </w:style>
-  <w:style w:type="paragraph" w:styleId="7">
-    <w:name w:val="heading 7"/>
-    <w:basedOn w:val="a"/>
-    <w:next w:val="a"/>
-    <w:link w:val="7Char"/>
-    <w:uiPriority w:val="9"/>
-    <w:semiHidden/>
-    <w:unhideWhenUsed/>
-    <w:qFormat/>
-    <w:rsid w:val="00426FC2"/>
-    <w:pPr>
-      <w:keepNext/>
-      <w:keepLines/>
-      <w:spacing w:before="40" w:after="0"/>
-      <w:outlineLvl w:val="6"/>
-    </w:pPr>
-    <w:rPr>
-      <w:rFonts w:eastAsiaTheme="majorEastAsia" w:cstheme="majorBidi"/>
-      <w:color w:val="595959" w:themeColor="text1" w:themeTint="A6"/>
-    </w:rPr>
-  </w:style>
-  <w:style w:type="paragraph" w:styleId="8">
-    <w:name w:val="heading 8"/>
-    <w:basedOn w:val="a"/>
-    <w:next w:val="a"/>
-    <w:link w:val="8Char"/>
-    <w:uiPriority w:val="9"/>
-    <w:semiHidden/>
-    <w:unhideWhenUsed/>
-    <w:qFormat/>
-    <w:rsid w:val="00426FC2"/>
-    <w:pPr>
-      <w:keepNext/>
-      <w:keepLines/>
-      <w:spacing w:after="0"/>
-      <w:outlineLvl w:val="7"/>
-    </w:pPr>
-    <w:rPr>
-      <w:rFonts w:eastAsiaTheme="majorEastAsia" w:cstheme="majorBidi"/>
-      <w:i/>
-      <w:iCs/>
-      <w:color w:val="272727" w:themeColor="text1" w:themeTint="D8"/>
-    </w:rPr>
-  </w:style>
-  <w:style w:type="paragraph" w:styleId="9">
-    <w:name w:val="heading 9"/>
-    <w:basedOn w:val="a"/>
-    <w:next w:val="a"/>
-    <w:link w:val="9Char"/>
-    <w:uiPriority w:val="9"/>
-    <w:semiHidden/>
-    <w:unhideWhenUsed/>
-    <w:qFormat/>
-    <w:rsid w:val="00426FC2"/>
-    <w:pPr>
-      <w:keepNext/>
-      <w:keepLines/>
-      <w:spacing w:after="0"/>
-      <w:outlineLvl w:val="8"/>
-    </w:pPr>
-    <w:rPr>
-      <w:rFonts w:eastAsiaTheme="majorEastAsia" w:cstheme="majorBidi"/>
-      <w:color w:val="272727" w:themeColor="text1" w:themeTint="D8"/>
+      <w:color w:val="80340D" w:themeColor="accent2" w:themeShade="80"/>
+      <w:sz w:val="22"/>
+      <w:szCs w:val="22"/>
     </w:rPr>
   </w:style>
   <w:style w:type="character" w:default="1" w:styleId="a0">
     <w:name w:val="Default Paragraph Font"/>
     <w:uiPriority w:val="1"/>
+    <w:semiHidden/>
     <w:unhideWhenUsed/>
   </w:style>
   <w:style w:type="table" w:default="1" w:styleId="a1">
@@ -750,10 +773,10 @@
     <w:basedOn w:val="a0"/>
     <w:link w:val="1"/>
     <w:uiPriority w:val="9"/>
-    <w:rsid w:val="00426FC2"/>
-    <w:rPr>
-      <w:rFonts w:asciiTheme="majorHAnsi" w:eastAsiaTheme="majorEastAsia" w:hAnsiTheme="majorHAnsi" w:cstheme="majorBidi"/>
-      <w:color w:val="0F4761" w:themeColor="accent1" w:themeShade="BF"/>
+    <w:rsid w:val="00F00DA0"/>
+    <w:rPr>
+      <w:rFonts w:asciiTheme="majorHAnsi" w:eastAsiaTheme="majorEastAsia" w:hAnsiTheme="majorHAnsi" w:cstheme="majorBidi"/>
+      <w:color w:val="262626" w:themeColor="text1" w:themeTint="D9"/>
       <w:sz w:val="40"/>
       <w:szCs w:val="40"/>
     </w:rPr>
@@ -764,104 +787,118 @@
     <w:link w:val="2"/>
     <w:uiPriority w:val="9"/>
     <w:semiHidden/>
-    <w:rsid w:val="00426FC2"/>
-    <w:rPr>
-      <w:rFonts w:asciiTheme="majorHAnsi" w:eastAsiaTheme="majorEastAsia" w:hAnsiTheme="majorHAnsi" w:cstheme="majorBidi"/>
-      <w:color w:val="0F4761" w:themeColor="accent1" w:themeShade="BF"/>
+    <w:rsid w:val="00F00DA0"/>
+    <w:rPr>
+      <w:rFonts w:asciiTheme="majorHAnsi" w:eastAsiaTheme="majorEastAsia" w:hAnsiTheme="majorHAnsi" w:cstheme="majorBidi"/>
+      <w:color w:val="E97132" w:themeColor="accent2"/>
+      <w:sz w:val="36"/>
+      <w:szCs w:val="36"/>
+    </w:rPr>
+  </w:style>
+  <w:style w:type="character" w:customStyle="1" w:styleId="3Char">
+    <w:name w:val="제목 3 Char"/>
+    <w:basedOn w:val="a0"/>
+    <w:link w:val="3"/>
+    <w:uiPriority w:val="9"/>
+    <w:semiHidden/>
+    <w:rsid w:val="00F00DA0"/>
+    <w:rPr>
+      <w:rFonts w:asciiTheme="majorHAnsi" w:eastAsiaTheme="majorEastAsia" w:hAnsiTheme="majorHAnsi" w:cstheme="majorBidi"/>
+      <w:color w:val="BF4E14" w:themeColor="accent2" w:themeShade="BF"/>
       <w:sz w:val="32"/>
       <w:szCs w:val="32"/>
     </w:rPr>
   </w:style>
-  <w:style w:type="character" w:customStyle="1" w:styleId="3Char">
-    <w:name w:val="제목 3 Char"/>
-    <w:basedOn w:val="a0"/>
-    <w:link w:val="3"/>
-    <w:uiPriority w:val="9"/>
-    <w:semiHidden/>
-    <w:rsid w:val="00426FC2"/>
-    <w:rPr>
-      <w:rFonts w:eastAsiaTheme="majorEastAsia" w:cstheme="majorBidi"/>
-      <w:color w:val="0F4761" w:themeColor="accent1" w:themeShade="BF"/>
+  <w:style w:type="character" w:customStyle="1" w:styleId="4Char">
+    <w:name w:val="제목 4 Char"/>
+    <w:basedOn w:val="a0"/>
+    <w:link w:val="4"/>
+    <w:uiPriority w:val="9"/>
+    <w:semiHidden/>
+    <w:rsid w:val="00F00DA0"/>
+    <w:rPr>
+      <w:rFonts w:asciiTheme="majorHAnsi" w:eastAsiaTheme="majorEastAsia" w:hAnsiTheme="majorHAnsi" w:cstheme="majorBidi"/>
+      <w:i/>
+      <w:iCs/>
+      <w:color w:val="80340D" w:themeColor="accent2" w:themeShade="80"/>
       <w:sz w:val="28"/>
       <w:szCs w:val="28"/>
     </w:rPr>
   </w:style>
-  <w:style w:type="character" w:customStyle="1" w:styleId="4Char">
-    <w:name w:val="제목 4 Char"/>
-    <w:basedOn w:val="a0"/>
-    <w:link w:val="4"/>
-    <w:uiPriority w:val="9"/>
-    <w:semiHidden/>
-    <w:rsid w:val="00426FC2"/>
-    <w:rPr>
-      <w:rFonts w:eastAsiaTheme="majorEastAsia" w:cstheme="majorBidi"/>
+  <w:style w:type="character" w:customStyle="1" w:styleId="5Char">
+    <w:name w:val="제목 5 Char"/>
+    <w:basedOn w:val="a0"/>
+    <w:link w:val="5"/>
+    <w:uiPriority w:val="9"/>
+    <w:semiHidden/>
+    <w:rsid w:val="00F00DA0"/>
+    <w:rPr>
+      <w:rFonts w:asciiTheme="majorHAnsi" w:eastAsiaTheme="majorEastAsia" w:hAnsiTheme="majorHAnsi" w:cstheme="majorBidi"/>
+      <w:color w:val="BF4E14" w:themeColor="accent2" w:themeShade="BF"/>
+      <w:sz w:val="24"/>
+      <w:szCs w:val="24"/>
+    </w:rPr>
+  </w:style>
+  <w:style w:type="character" w:customStyle="1" w:styleId="6Char">
+    <w:name w:val="제목 6 Char"/>
+    <w:basedOn w:val="a0"/>
+    <w:link w:val="6"/>
+    <w:uiPriority w:val="9"/>
+    <w:semiHidden/>
+    <w:rsid w:val="00F00DA0"/>
+    <w:rPr>
+      <w:rFonts w:asciiTheme="majorHAnsi" w:eastAsiaTheme="majorEastAsia" w:hAnsiTheme="majorHAnsi" w:cstheme="majorBidi"/>
       <w:i/>
       <w:iCs/>
-      <w:color w:val="0F4761" w:themeColor="accent1" w:themeShade="BF"/>
-    </w:rPr>
-  </w:style>
-  <w:style w:type="character" w:customStyle="1" w:styleId="5Char">
-    <w:name w:val="제목 5 Char"/>
-    <w:basedOn w:val="a0"/>
-    <w:link w:val="5"/>
-    <w:uiPriority w:val="9"/>
-    <w:semiHidden/>
-    <w:rsid w:val="00426FC2"/>
-    <w:rPr>
-      <w:rFonts w:eastAsiaTheme="majorEastAsia" w:cstheme="majorBidi"/>
-      <w:color w:val="0F4761" w:themeColor="accent1" w:themeShade="BF"/>
-    </w:rPr>
-  </w:style>
-  <w:style w:type="character" w:customStyle="1" w:styleId="6Char">
-    <w:name w:val="제목 6 Char"/>
-    <w:basedOn w:val="a0"/>
-    <w:link w:val="6"/>
-    <w:uiPriority w:val="9"/>
-    <w:semiHidden/>
-    <w:rsid w:val="00426FC2"/>
-    <w:rPr>
-      <w:rFonts w:eastAsiaTheme="majorEastAsia" w:cstheme="majorBidi"/>
+      <w:color w:val="80340D" w:themeColor="accent2" w:themeShade="80"/>
+      <w:sz w:val="24"/>
+      <w:szCs w:val="24"/>
+    </w:rPr>
+  </w:style>
+  <w:style w:type="character" w:customStyle="1" w:styleId="7Char">
+    <w:name w:val="제목 7 Char"/>
+    <w:basedOn w:val="a0"/>
+    <w:link w:val="7"/>
+    <w:uiPriority w:val="9"/>
+    <w:semiHidden/>
+    <w:rsid w:val="00F00DA0"/>
+    <w:rPr>
+      <w:rFonts w:asciiTheme="majorHAnsi" w:eastAsiaTheme="majorEastAsia" w:hAnsiTheme="majorHAnsi" w:cstheme="majorBidi"/>
+      <w:b/>
+      <w:bCs/>
+      <w:color w:val="80340D" w:themeColor="accent2" w:themeShade="80"/>
+      <w:sz w:val="22"/>
+      <w:szCs w:val="22"/>
+    </w:rPr>
+  </w:style>
+  <w:style w:type="character" w:customStyle="1" w:styleId="8Char">
+    <w:name w:val="제목 8 Char"/>
+    <w:basedOn w:val="a0"/>
+    <w:link w:val="8"/>
+    <w:uiPriority w:val="9"/>
+    <w:semiHidden/>
+    <w:rsid w:val="00F00DA0"/>
+    <w:rPr>
+      <w:rFonts w:asciiTheme="majorHAnsi" w:eastAsiaTheme="majorEastAsia" w:hAnsiTheme="majorHAnsi" w:cstheme="majorBidi"/>
+      <w:color w:val="80340D" w:themeColor="accent2" w:themeShade="80"/>
+      <w:sz w:val="22"/>
+      <w:szCs w:val="22"/>
+    </w:rPr>
+  </w:style>
+  <w:style w:type="character" w:customStyle="1" w:styleId="9Char">
+    <w:name w:val="제목 9 Char"/>
+    <w:basedOn w:val="a0"/>
+    <w:link w:val="9"/>
+    <w:uiPriority w:val="9"/>
+    <w:semiHidden/>
+    <w:rsid w:val="00F00DA0"/>
+    <w:rPr>
+      <w:rFonts w:asciiTheme="majorHAnsi" w:eastAsiaTheme="majorEastAsia" w:hAnsiTheme="majorHAnsi" w:cstheme="majorBidi"/>
       <w:i/>
       <w:iCs/>
-      <w:color w:val="595959" w:themeColor="text1" w:themeTint="A6"/>
-    </w:rPr>
-  </w:style>
-  <w:style w:type="character" w:customStyle="1" w:styleId="7Char">
-    <w:name w:val="제목 7 Char"/>
-    <w:basedOn w:val="a0"/>
-    <w:link w:val="7"/>
-    <w:uiPriority w:val="9"/>
-    <w:semiHidden/>
-    <w:rsid w:val="00426FC2"/>
-    <w:rPr>
-      <w:rFonts w:eastAsiaTheme="majorEastAsia" w:cstheme="majorBidi"/>
-      <w:color w:val="595959" w:themeColor="text1" w:themeTint="A6"/>
-    </w:rPr>
-  </w:style>
-  <w:style w:type="character" w:customStyle="1" w:styleId="8Char">
-    <w:name w:val="제목 8 Char"/>
-    <w:basedOn w:val="a0"/>
-    <w:link w:val="8"/>
-    <w:uiPriority w:val="9"/>
-    <w:semiHidden/>
-    <w:rsid w:val="00426FC2"/>
-    <w:rPr>
-      <w:rFonts w:eastAsiaTheme="majorEastAsia" w:cstheme="majorBidi"/>
-      <w:i/>
-      <w:iCs/>
-      <w:color w:val="272727" w:themeColor="text1" w:themeTint="D8"/>
-    </w:rPr>
-  </w:style>
-  <w:style w:type="character" w:customStyle="1" w:styleId="9Char">
-    <w:name w:val="제목 9 Char"/>
-    <w:basedOn w:val="a0"/>
-    <w:link w:val="9"/>
-    <w:uiPriority w:val="9"/>
-    <w:semiHidden/>
-    <w:rsid w:val="00426FC2"/>
-    <w:rPr>
-      <w:rFonts w:eastAsiaTheme="majorEastAsia" w:cstheme="majorBidi"/>
-      <w:color w:val="272727" w:themeColor="text1" w:themeTint="D8"/>
+      <w:color w:val="80340D" w:themeColor="accent2" w:themeShade="80"/>
+      <w:sz w:val="22"/>
+      <w:szCs w:val="22"/>
     </w:rPr>
   </w:style>
   <w:style w:type="paragraph" w:styleId="a3">
@@ -871,17 +908,16 @@
     <w:link w:val="Char"/>
     <w:uiPriority w:val="10"/>
     <w:qFormat/>
-    <w:rsid w:val="00426FC2"/>
-    <w:pPr>
-      <w:spacing w:after="80" w:line="240" w:lineRule="auto"/>
+    <w:rsid w:val="00F00DA0"/>
+    <w:pPr>
+      <w:spacing w:after="0" w:line="240" w:lineRule="auto"/>
       <w:contextualSpacing/>
     </w:pPr>
     <w:rPr>
       <w:rFonts w:asciiTheme="majorHAnsi" w:eastAsiaTheme="majorEastAsia" w:hAnsiTheme="majorHAnsi" w:cstheme="majorBidi"/>
-      <w:spacing w:val="-10"/>
-      <w:kern w:val="28"/>
-      <w:sz w:val="56"/>
-      <w:szCs w:val="56"/>
+      <w:color w:val="262626" w:themeColor="text1" w:themeTint="D9"/>
+      <w:sz w:val="96"/>
+      <w:szCs w:val="96"/>
     </w:rPr>
   </w:style>
   <w:style w:type="character" w:customStyle="1" w:styleId="Char">
@@ -889,13 +925,12 @@
     <w:basedOn w:val="a0"/>
     <w:link w:val="a3"/>
     <w:uiPriority w:val="10"/>
-    <w:rsid w:val="00426FC2"/>
-    <w:rPr>
-      <w:rFonts w:asciiTheme="majorHAnsi" w:eastAsiaTheme="majorEastAsia" w:hAnsiTheme="majorHAnsi" w:cstheme="majorBidi"/>
-      <w:spacing w:val="-10"/>
-      <w:kern w:val="28"/>
-      <w:sz w:val="56"/>
-      <w:szCs w:val="56"/>
+    <w:rsid w:val="00F00DA0"/>
+    <w:rPr>
+      <w:rFonts w:asciiTheme="majorHAnsi" w:eastAsiaTheme="majorEastAsia" w:hAnsiTheme="majorHAnsi" w:cstheme="majorBidi"/>
+      <w:color w:val="262626" w:themeColor="text1" w:themeTint="D9"/>
+      <w:sz w:val="96"/>
+      <w:szCs w:val="96"/>
     </w:rPr>
   </w:style>
   <w:style w:type="paragraph" w:styleId="a4">
@@ -905,16 +940,17 @@
     <w:link w:val="Char0"/>
     <w:uiPriority w:val="11"/>
     <w:qFormat/>
-    <w:rsid w:val="00426FC2"/>
+    <w:rsid w:val="00F00DA0"/>
     <w:pPr>
       <w:numPr>
         <w:ilvl w:val="1"/>
       </w:numPr>
-    </w:pPr>
-    <w:rPr>
-      <w:rFonts w:eastAsiaTheme="majorEastAsia" w:cstheme="majorBidi"/>
-      <w:color w:val="595959" w:themeColor="text1" w:themeTint="A6"/>
-      <w:spacing w:val="15"/>
+      <w:spacing w:after="240"/>
+    </w:pPr>
+    <w:rPr>
+      <w:caps/>
+      <w:color w:val="404040" w:themeColor="text1" w:themeTint="BF"/>
+      <w:spacing w:val="20"/>
       <w:sz w:val="28"/>
       <w:szCs w:val="28"/>
     </w:rPr>
@@ -924,11 +960,11 @@
     <w:basedOn w:val="a0"/>
     <w:link w:val="a4"/>
     <w:uiPriority w:val="11"/>
-    <w:rsid w:val="00426FC2"/>
-    <w:rPr>
-      <w:rFonts w:eastAsiaTheme="majorEastAsia" w:cstheme="majorBidi"/>
-      <w:color w:val="595959" w:themeColor="text1" w:themeTint="A6"/>
-      <w:spacing w:val="15"/>
+    <w:rsid w:val="00F00DA0"/>
+    <w:rPr>
+      <w:caps/>
+      <w:color w:val="404040" w:themeColor="text1" w:themeTint="BF"/>
+      <w:spacing w:val="20"/>
       <w:sz w:val="28"/>
       <w:szCs w:val="28"/>
     </w:rPr>
@@ -940,50 +976,59 @@
     <w:link w:val="Char1"/>
     <w:uiPriority w:val="29"/>
     <w:qFormat/>
+    <w:rsid w:val="00F00DA0"/>
+    <w:pPr>
+      <w:spacing w:before="160"/>
+      <w:ind w:left="720" w:right="720"/>
+      <w:jc w:val="center"/>
+    </w:pPr>
+    <w:rPr>
+      <w:rFonts w:asciiTheme="majorHAnsi" w:eastAsiaTheme="majorEastAsia" w:hAnsiTheme="majorHAnsi" w:cstheme="majorBidi"/>
+      <w:color w:val="000000" w:themeColor="text1"/>
+      <w:sz w:val="24"/>
+      <w:szCs w:val="24"/>
+    </w:rPr>
+  </w:style>
+  <w:style w:type="character" w:customStyle="1" w:styleId="Char1">
+    <w:name w:val="인용 Char"/>
+    <w:basedOn w:val="a0"/>
+    <w:link w:val="a5"/>
+    <w:uiPriority w:val="29"/>
+    <w:rsid w:val="00F00DA0"/>
+    <w:rPr>
+      <w:rFonts w:asciiTheme="majorHAnsi" w:eastAsiaTheme="majorEastAsia" w:hAnsiTheme="majorHAnsi" w:cstheme="majorBidi"/>
+      <w:color w:val="000000" w:themeColor="text1"/>
+      <w:sz w:val="24"/>
+      <w:szCs w:val="24"/>
+    </w:rPr>
+  </w:style>
+  <w:style w:type="paragraph" w:styleId="a6">
+    <w:name w:val="List Paragraph"/>
+    <w:basedOn w:val="a"/>
+    <w:uiPriority w:val="34"/>
+    <w:qFormat/>
     <w:rsid w:val="00426FC2"/>
     <w:pPr>
-      <w:spacing w:before="160"/>
-      <w:jc w:val="center"/>
-    </w:pPr>
-    <w:rPr>
+      <w:ind w:left="720"/>
+      <w:contextualSpacing/>
+    </w:pPr>
+  </w:style>
+  <w:style w:type="character" w:styleId="a7">
+    <w:name w:val="Intense Emphasis"/>
+    <w:basedOn w:val="a0"/>
+    <w:uiPriority w:val="21"/>
+    <w:qFormat/>
+    <w:rsid w:val="00F00DA0"/>
+    <w:rPr>
+      <w:b/>
+      <w:bCs/>
       <w:i/>
       <w:iCs/>
-      <w:color w:val="404040" w:themeColor="text1" w:themeTint="BF"/>
-    </w:rPr>
-  </w:style>
-  <w:style w:type="character" w:customStyle="1" w:styleId="Char1">
-    <w:name w:val="인용 Char"/>
-    <w:basedOn w:val="a0"/>
-    <w:link w:val="a5"/>
-    <w:uiPriority w:val="29"/>
-    <w:rsid w:val="00426FC2"/>
-    <w:rPr>
-      <w:i/>
-      <w:iCs/>
-      <w:color w:val="404040" w:themeColor="text1" w:themeTint="BF"/>
-    </w:rPr>
-  </w:style>
-  <w:style w:type="paragraph" w:styleId="a6">
-    <w:name w:val="List Paragraph"/>
-    <w:basedOn w:val="a"/>
-    <w:uiPriority w:val="34"/>
-    <w:qFormat/>
-    <w:rsid w:val="00426FC2"/>
-    <w:pPr>
-      <w:ind w:left="720"/>
-      <w:contextualSpacing/>
-    </w:pPr>
-  </w:style>
-  <w:style w:type="character" w:styleId="a7">
-    <w:name w:val="Intense Emphasis"/>
-    <w:basedOn w:val="a0"/>
-    <w:uiPriority w:val="21"/>
-    <w:qFormat/>
-    <w:rsid w:val="00426FC2"/>
-    <w:rPr>
-      <w:i/>
-      <w:iCs/>
-      <w:color w:val="0F4761" w:themeColor="accent1" w:themeShade="BF"/>
+      <w:caps w:val="0"/>
+      <w:smallCaps w:val="0"/>
+      <w:strike w:val="0"/>
+      <w:dstrike w:val="0"/>
+      <w:color w:val="E97132" w:themeColor="accent2"/>
     </w:rPr>
   </w:style>
   <w:style w:type="paragraph" w:styleId="a8">
@@ -993,20 +1038,19 @@
     <w:link w:val="Char2"/>
     <w:uiPriority w:val="30"/>
     <w:qFormat/>
-    <w:rsid w:val="00426FC2"/>
+    <w:rsid w:val="00F00DA0"/>
     <w:pPr>
       <w:pBdr>
-        <w:top w:val="single" w:sz="4" w:space="10" w:color="0F4761" w:themeColor="accent1" w:themeShade="BF"/>
-        <w:bottom w:val="single" w:sz="4" w:space="10" w:color="0F4761" w:themeColor="accent1" w:themeShade="BF"/>
+        <w:top w:val="single" w:sz="24" w:space="4" w:color="E97132" w:themeColor="accent2"/>
       </w:pBdr>
-      <w:spacing w:before="360" w:after="360"/>
-      <w:ind w:left="864" w:right="864"/>
+      <w:spacing w:before="240" w:after="240" w:line="240" w:lineRule="auto"/>
+      <w:ind w:left="936" w:right="936"/>
       <w:jc w:val="center"/>
     </w:pPr>
     <w:rPr>
-      <w:i/>
-      <w:iCs/>
-      <w:color w:val="0F4761" w:themeColor="accent1" w:themeShade="BF"/>
+      <w:rFonts w:asciiTheme="majorHAnsi" w:eastAsiaTheme="majorEastAsia" w:hAnsiTheme="majorHAnsi" w:cstheme="majorBidi"/>
+      <w:sz w:val="24"/>
+      <w:szCs w:val="24"/>
     </w:rPr>
   </w:style>
   <w:style w:type="character" w:customStyle="1" w:styleId="Char2">
@@ -1014,11 +1058,11 @@
     <w:basedOn w:val="a0"/>
     <w:link w:val="a8"/>
     <w:uiPriority w:val="30"/>
-    <w:rsid w:val="00426FC2"/>
-    <w:rPr>
-      <w:i/>
-      <w:iCs/>
-      <w:color w:val="0F4761" w:themeColor="accent1" w:themeShade="BF"/>
+    <w:rsid w:val="00F00DA0"/>
+    <w:rPr>
+      <w:rFonts w:asciiTheme="majorHAnsi" w:eastAsiaTheme="majorEastAsia" w:hAnsiTheme="majorHAnsi" w:cstheme="majorBidi"/>
+      <w:sz w:val="24"/>
+      <w:szCs w:val="24"/>
     </w:rPr>
   </w:style>
   <w:style w:type="character" w:styleId="a9">
@@ -1026,13 +1070,15 @@
     <w:basedOn w:val="a0"/>
     <w:uiPriority w:val="32"/>
     <w:qFormat/>
-    <w:rsid w:val="00426FC2"/>
+    <w:rsid w:val="00F00DA0"/>
     <w:rPr>
       <w:b/>
       <w:bCs/>
+      <w:caps w:val="0"/>
       <w:smallCaps/>
-      <w:color w:val="0F4761" w:themeColor="accent1" w:themeShade="BF"/>
-      <w:spacing w:val="5"/>
+      <w:color w:val="auto"/>
+      <w:spacing w:val="0"/>
+      <w:u w:val="single"/>
     </w:rPr>
   </w:style>
   <w:style w:type="paragraph" w:styleId="aa">
@@ -1078,6 +1124,111 @@
     <w:link w:val="ab"/>
     <w:uiPriority w:val="99"/>
     <w:rsid w:val="00094A4E"/>
+  </w:style>
+  <w:style w:type="paragraph" w:styleId="ac">
+    <w:name w:val="caption"/>
+    <w:basedOn w:val="a"/>
+    <w:next w:val="a"/>
+    <w:uiPriority w:val="35"/>
+    <w:semiHidden/>
+    <w:unhideWhenUsed/>
+    <w:qFormat/>
+    <w:rsid w:val="00F00DA0"/>
+    <w:pPr>
+      <w:spacing w:line="240" w:lineRule="auto"/>
+    </w:pPr>
+    <w:rPr>
+      <w:b/>
+      <w:bCs/>
+      <w:color w:val="404040" w:themeColor="text1" w:themeTint="BF"/>
+      <w:sz w:val="16"/>
+      <w:szCs w:val="16"/>
+    </w:rPr>
+  </w:style>
+  <w:style w:type="character" w:styleId="ad">
+    <w:name w:val="Strong"/>
+    <w:basedOn w:val="a0"/>
+    <w:uiPriority w:val="22"/>
+    <w:qFormat/>
+    <w:rsid w:val="00F00DA0"/>
+    <w:rPr>
+      <w:b/>
+      <w:bCs/>
+    </w:rPr>
+  </w:style>
+  <w:style w:type="character" w:styleId="ae">
+    <w:name w:val="Emphasis"/>
+    <w:basedOn w:val="a0"/>
+    <w:uiPriority w:val="20"/>
+    <w:qFormat/>
+    <w:rsid w:val="00F00DA0"/>
+    <w:rPr>
+      <w:i/>
+      <w:iCs/>
+      <w:color w:val="000000" w:themeColor="text1"/>
+    </w:rPr>
+  </w:style>
+  <w:style w:type="paragraph" w:styleId="af">
+    <w:name w:val="No Spacing"/>
+    <w:uiPriority w:val="1"/>
+    <w:qFormat/>
+    <w:rsid w:val="00F00DA0"/>
+    <w:pPr>
+      <w:spacing w:after="0" w:line="240" w:lineRule="auto"/>
+    </w:pPr>
+  </w:style>
+  <w:style w:type="character" w:styleId="af0">
+    <w:name w:val="Subtle Emphasis"/>
+    <w:basedOn w:val="a0"/>
+    <w:uiPriority w:val="19"/>
+    <w:qFormat/>
+    <w:rsid w:val="00F00DA0"/>
+    <w:rPr>
+      <w:i/>
+      <w:iCs/>
+      <w:color w:val="595959" w:themeColor="text1" w:themeTint="A6"/>
+    </w:rPr>
+  </w:style>
+  <w:style w:type="character" w:styleId="af1">
+    <w:name w:val="Subtle Reference"/>
+    <w:basedOn w:val="a0"/>
+    <w:uiPriority w:val="31"/>
+    <w:qFormat/>
+    <w:rsid w:val="00F00DA0"/>
+    <w:rPr>
+      <w:caps w:val="0"/>
+      <w:smallCaps/>
+      <w:color w:val="404040" w:themeColor="text1" w:themeTint="BF"/>
+      <w:spacing w:val="0"/>
+      <w:u w:val="single" w:color="7F7F7F" w:themeColor="text1" w:themeTint="80"/>
+    </w:rPr>
+  </w:style>
+  <w:style w:type="character" w:styleId="af2">
+    <w:name w:val="Book Title"/>
+    <w:basedOn w:val="a0"/>
+    <w:uiPriority w:val="33"/>
+    <w:qFormat/>
+    <w:rsid w:val="00F00DA0"/>
+    <w:rPr>
+      <w:b/>
+      <w:bCs/>
+      <w:caps w:val="0"/>
+      <w:smallCaps/>
+      <w:spacing w:val="0"/>
+    </w:rPr>
+  </w:style>
+  <w:style w:type="paragraph" w:styleId="TOC">
+    <w:name w:val="TOC Heading"/>
+    <w:basedOn w:val="1"/>
+    <w:next w:val="a"/>
+    <w:uiPriority w:val="39"/>
+    <w:semiHidden/>
+    <w:unhideWhenUsed/>
+    <w:qFormat/>
+    <w:rsid w:val="00F00DA0"/>
+    <w:pPr>
+      <w:outlineLvl w:val="9"/>
+    </w:pPr>
   </w:style>
 </w:styles>
 </file>

</xml_diff>